<commit_message>
Discovered missing info in how Region change is made. Started researching fixes
</commit_message>
<xml_diff>
--- a/Documentation/Inferno Jockey  V1 Architecture.docx
+++ b/Documentation/Inferno Jockey  V1 Architecture.docx
@@ -308,6 +308,16 @@
     </w:p>
     <w:p>
       <w:pPr>
+        <w:pStyle w:val="Heading2"/>
+      </w:pPr>
+      <w:proofErr w:type="spellStart"/>
+      <w:r>
+        <w:t>RegionConfig</w:t>
+      </w:r>
+      <w:proofErr w:type="spellEnd"/>
+    </w:p>
+    <w:p>
+      <w:pPr>
         <w:rPr>
           <w:b/>
           <w:bCs/>
@@ -347,6 +357,19 @@
           <w:bCs/>
         </w:rPr>
         <w:t>)</w:t>
+      </w:r>
+    </w:p>
+    <w:p>
+      <w:pPr>
+        <w:pStyle w:val="Heading3"/>
+      </w:pPr>
+      <w:r>
+        <w:t>Missing Info</w:t>
+      </w:r>
+    </w:p>
+    <w:p>
+      <w:r>
+        <w:t xml:space="preserve">info on how to transition between regions. </w:t>
       </w:r>
     </w:p>
     <w:p>
@@ -624,6 +647,20 @@
     </w:p>
     <w:p>
       <w:pPr>
+        <w:pStyle w:val="Heading2"/>
+        <w:rPr>
+          <w:b/>
+          <w:bCs/>
+        </w:rPr>
+      </w:pPr>
+      <w:proofErr w:type="spellStart"/>
+      <w:r>
+        <w:t>SaveAndGameManager</w:t>
+      </w:r>
+      <w:proofErr w:type="spellEnd"/>
+    </w:p>
+    <w:p>
+      <w:pPr>
         <w:rPr>
           <w:b/>
           <w:bCs/>
@@ -714,6 +751,7 @@
         </w:numPr>
       </w:pPr>
       <w:r>
+        <w:lastRenderedPageBreak/>
         <w:t xml:space="preserve">public int </w:t>
       </w:r>
       <w:proofErr w:type="spellStart"/>
@@ -763,7 +801,6 @@
       <w:proofErr w:type="spellStart"/>
       <w:proofErr w:type="gramStart"/>
       <w:r>
-        <w:lastRenderedPageBreak/>
         <w:t>SaveProfile</w:t>
       </w:r>
       <w:proofErr w:type="spellEnd"/>
@@ -891,6 +928,22 @@
     </w:p>
     <w:p>
       <w:pPr>
+        <w:pStyle w:val="Heading2"/>
+        <w:rPr>
+          <w:b/>
+          <w:bCs/>
+        </w:rPr>
+      </w:pPr>
+      <w:proofErr w:type="spellStart"/>
+      <w:proofErr w:type="gramStart"/>
+      <w:r>
+        <w:t>ContractManager</w:t>
+      </w:r>
+      <w:proofErr w:type="spellEnd"/>
+      <w:proofErr w:type="gramEnd"/>
+    </w:p>
+    <w:p>
+      <w:pPr>
         <w:rPr>
           <w:b/>
           <w:bCs/>
@@ -1122,6 +1175,7 @@
           <w:b/>
           <w:bCs/>
         </w:rPr>
+        <w:lastRenderedPageBreak/>
         <w:t>Penalty Multiplier</w:t>
       </w:r>
       <w:r>
@@ -1177,7 +1231,6 @@
         </w:numPr>
       </w:pPr>
       <w:r>
-        <w:lastRenderedPageBreak/>
         <w:t xml:space="preserve">Implement contract structure variables (10 ore/20 min, 100 ore/24 </w:t>
       </w:r>
       <w:proofErr w:type="spellStart"/>
@@ -1218,6 +1271,20 @@
     </w:p>
     <w:p>
       <w:pPr>
+        <w:pStyle w:val="Heading2"/>
+        <w:rPr>
+          <w:b/>
+          <w:bCs/>
+        </w:rPr>
+      </w:pPr>
+      <w:proofErr w:type="spellStart"/>
+      <w:r>
+        <w:t>SimpleObjectPool</w:t>
+      </w:r>
+      <w:proofErr w:type="spellEnd"/>
+    </w:p>
+    <w:p>
+      <w:pPr>
         <w:rPr>
           <w:b/>
           <w:bCs/>
@@ -1485,6 +1552,20 @@
     </w:p>
     <w:p>
       <w:pPr>
+        <w:pStyle w:val="Heading2"/>
+        <w:rPr>
+          <w:b/>
+          <w:bCs/>
+        </w:rPr>
+      </w:pPr>
+      <w:proofErr w:type="spellStart"/>
+      <w:r>
+        <w:t>PlayerCameraSystem</w:t>
+      </w:r>
+      <w:proofErr w:type="spellEnd"/>
+    </w:p>
+    <w:p>
+      <w:pPr>
         <w:rPr>
           <w:b/>
           <w:bCs/>
@@ -1569,6 +1650,7 @@
         </w:numPr>
       </w:pPr>
       <w:r>
+        <w:lastRenderedPageBreak/>
         <w:t xml:space="preserve">int </w:t>
       </w:r>
       <w:proofErr w:type="spellStart"/>
@@ -1660,7 +1742,6 @@
         </w:numPr>
       </w:pPr>
       <w:r>
-        <w:lastRenderedPageBreak/>
         <w:t xml:space="preserve">If a player clicks an edge button, translate the camera to the destination lane position via a fast lerp/tween. </w:t>
       </w:r>
     </w:p>
@@ -1749,6 +1830,20 @@
     </w:p>
     <w:p>
       <w:pPr>
+        <w:pStyle w:val="Heading2"/>
+        <w:rPr>
+          <w:b/>
+          <w:bCs/>
+        </w:rPr>
+      </w:pPr>
+      <w:proofErr w:type="spellStart"/>
+      <w:r>
+        <w:t>PooledItem</w:t>
+      </w:r>
+      <w:proofErr w:type="spellEnd"/>
+    </w:p>
+    <w:p>
+      <w:pPr>
         <w:rPr>
           <w:b/>
           <w:bCs/>
@@ -1976,6 +2071,7 @@
           <w:b/>
           <w:bCs/>
         </w:rPr>
+        <w:lastRenderedPageBreak/>
         <w:t>Build Plan:</w:t>
       </w:r>
     </w:p>
@@ -2019,6 +2115,32 @@
     </w:p>
     <w:p>
       <w:pPr>
+        <w:pStyle w:val="Heading2"/>
+        <w:rPr>
+          <w:b/>
+          <w:bCs/>
+        </w:rPr>
+      </w:pPr>
+      <w:proofErr w:type="spellStart"/>
+      <w:r>
+        <w:t>RunManager</w:t>
+      </w:r>
+      <w:proofErr w:type="spellEnd"/>
+      <w:r>
+        <w:rPr>
+          <w:b/>
+          <w:bCs/>
+        </w:rPr>
+        <w:t xml:space="preserve"> &amp; </w:t>
+      </w:r>
+      <w:proofErr w:type="spellStart"/>
+      <w:r>
+        <w:t>SpawnManager</w:t>
+      </w:r>
+      <w:proofErr w:type="spellEnd"/>
+    </w:p>
+    <w:p>
+      <w:pPr>
         <w:rPr>
           <w:b/>
           <w:bCs/>
@@ -2086,7 +2208,6 @@
           <w:b/>
           <w:bCs/>
         </w:rPr>
-        <w:lastRenderedPageBreak/>
         <w:t>Fields:</w:t>
       </w:r>
     </w:p>
@@ -2326,6 +2447,7 @@
           <w:b/>
           <w:bCs/>
         </w:rPr>
+        <w:lastRenderedPageBreak/>
         <w:t>Collision Resolutions</w:t>
       </w:r>
       <w:r>
@@ -2443,7 +2565,6 @@
         </w:numPr>
       </w:pPr>
       <w:r>
-        <w:lastRenderedPageBreak/>
         <w:t xml:space="preserve">Write the main tick timer loop and hook up the movement loop for active objects. </w:t>
       </w:r>
     </w:p>
@@ -5299,7 +5420,6 @@
     <w:next w:val="Normal"/>
     <w:link w:val="Heading3Char"/>
     <w:uiPriority w:val="9"/>
-    <w:semiHidden/>
     <w:unhideWhenUsed/>
     <w:qFormat/>
     <w:rsid w:val="004E2939"/>
@@ -5451,6 +5571,7 @@
   <w:style w:type="character" w:default="1" w:styleId="DefaultParagraphFont">
     <w:name w:val="Default Paragraph Font"/>
     <w:uiPriority w:val="1"/>
+    <w:semiHidden/>
     <w:unhideWhenUsed/>
   </w:style>
   <w:style w:type="table" w:default="1" w:styleId="TableNormal">
@@ -5505,7 +5626,6 @@
     <w:basedOn w:val="DefaultParagraphFont"/>
     <w:link w:val="Heading3"/>
     <w:uiPriority w:val="9"/>
-    <w:semiHidden/>
     <w:rsid w:val="004E2939"/>
     <w:rPr>
       <w:rFonts w:eastAsiaTheme="majorEastAsia" w:cstheme="majorBidi"/>

</xml_diff>